<commit_message>
Refresh specifications and operation manual
</commit_message>
<xml_diff>
--- a/docs/電子請求書管理_操作マニュアル.docx
+++ b/docs/電子請求書管理_操作マニュアル.docx
@@ -19,7 +19,7 @@
           <w:color w:val="009C9A"/>
           <w:sz w:val="22"/>
         </w:rPr>
-        <w:t>配布先ユーザー向け</w:t>
+        <w:t>運用ユーザー向け</w:t>
       </w:r>
     </w:p>
     <w:p>
@@ -76,6 +76,7 @@
     </w:p>
     <w:p>
       <w:pPr>
+        <w:pStyle w:val="Title"/>
         <w:spacing w:before="160" w:after="160"/>
         <w:jc w:val="center"/>
       </w:pPr>
@@ -83,7 +84,7 @@
         <w:rPr>
           <w:rFonts w:ascii="Calibri" w:hAnsi="Calibri" w:eastAsia="Yu Gothic"/>
           <w:b/>
-          <w:color w:val="0B2545"/>
+          <w:color w:val="000000"/>
           <w:sz w:val="56"/>
         </w:rPr>
         <w:t>電子請求書管理</w:t>
@@ -108,14 +109,6 @@
     </w:p>
     <w:p>
       <w:pPr>
-        <w:spacing w:after="320"/>
-        <w:pBdr>
-          <w:bottom w:val="single" w:sz="14" w:space="3" w:color="009C9A"/>
-        </w:pBdr>
-      </w:pPr>
-    </w:p>
-    <w:p>
-      <w:pPr>
         <w:spacing w:after="160"/>
         <w:jc w:val="center"/>
       </w:pPr>
@@ -126,7 +119,7 @@
           <w:color w:val="0B2545"/>
           <w:sz w:val="22"/>
         </w:rPr>
-        <w:t>2026年8月版</w:t>
+        <w:t>2026年9月版</w:t>
       </w:r>
     </w:p>
     <w:p>
@@ -139,7 +132,7 @@
           <w:color w:val="667085"/>
           <w:sz w:val="20"/>
         </w:rPr>
-        <w:t>CSV＋zip取込 / 請求一覧 / 税表示切替 / 工種振分 / PDF確認 / Excel出力</w:t>
+        <w:t>CSV＋zip取込 / 請求一覧 / 税表示切替 / 工種振分 / 工事表示 / PDF確認 / Excel出力</w:t>
       </w:r>
     </w:p>
     <w:p>
@@ -173,15 +166,12 @@
     <w:p>
       <w:pPr>
         <w:pStyle w:val="Heading1"/>
-        <w:pBdr>
-          <w:bottom w:val="single" w:sz="8" w:space="4" w:color="E8EEF5"/>
-        </w:pBdr>
       </w:pPr>
       <w:r>
         <w:rPr>
           <w:rFonts w:ascii="Calibri" w:hAnsi="Calibri" w:eastAsia="Yu Gothic"/>
           <w:b/>
-          <w:color w:val="2E74B5"/>
+          <w:color w:val="000000"/>
           <w:sz w:val="32"/>
         </w:rPr>
         <w:t>1  まず知っておくこと</w:t>
@@ -240,7 +230,7 @@
               <w:rPr>
                 <w:rFonts w:ascii="Calibri" w:hAnsi="Calibri" w:eastAsia="Yu Gothic"/>
               </w:rPr>
-              <w:t>CSV取込値とDB保存値は税込のままです。初期画面だけ税抜で表示し、［金額表示］から税込へ切り替えられます。</w:t>
+              <w:t>CSVの請求金額(税込)は原本額として保持し、アプリ内の計算と工種振分入力は税抜を基準にします。初期表示は税抜で、［金額表示］から税込へ切り替えられます。</w:t>
             </w:r>
           </w:p>
         </w:tc>
@@ -1007,7 +997,7 @@
                 <w:rFonts w:ascii="Calibri" w:hAnsi="Calibri" w:eastAsia="Yu Gothic"/>
                 <w:sz w:val="19"/>
               </w:rPr>
-              <w:t>CSV / DB / Excel</w:t>
+              <w:t>金額データ</w:t>
             </w:r>
           </w:p>
         </w:tc>
@@ -1030,7 +1020,7 @@
                 <w:rFonts w:ascii="Calibri" w:hAnsi="Calibri" w:eastAsia="Yu Gothic"/>
                 <w:sz w:val="19"/>
               </w:rPr>
-              <w:t>税込のまま変更しません</w:t>
+              <w:t>CSVとExcelは税込。DBは税込原本額と税抜計算額を保持</w:t>
             </w:r>
           </w:p>
         </w:tc>
@@ -1049,15 +1039,12 @@
     <w:p>
       <w:pPr>
         <w:pStyle w:val="Heading1"/>
-        <w:pBdr>
-          <w:bottom w:val="single" w:sz="8" w:space="4" w:color="E8EEF5"/>
-        </w:pBdr>
       </w:pPr>
       <w:r>
         <w:rPr>
           <w:rFonts w:ascii="Calibri" w:hAnsi="Calibri" w:eastAsia="Yu Gothic"/>
           <w:b/>
-          <w:color w:val="2E74B5"/>
+          <w:color w:val="000000"/>
           <w:sz w:val="32"/>
         </w:rPr>
         <w:t>2  起動する</w:t>
@@ -1073,7 +1060,7 @@
           <w:color w:val="667085"/>
           <w:sz w:val="20"/>
         </w:rPr>
-        <w:t>配布フォルダは構成を変えずに使用します</w:t>
+        <w:t>通常運用は起動.batから開始します</w:t>
       </w:r>
     </w:p>
     <w:p>
@@ -1129,51 +1116,182 @@
         <w:t>アプリのGRアイコン</w:t>
       </w:r>
     </w:p>
-    <w:p>
-      <w:pPr>
-        <w:numPr>
-          <w:ilvl w:val="0"/>
-          <w:numId w:val="10"/>
-        </w:numPr>
-        <w:spacing w:after="80" w:line="300" w:lineRule="auto"/>
-      </w:pPr>
-      <w:r>
-        <w:rPr>
-          <w:rFonts w:ascii="Calibri" w:hAnsi="Calibri" w:eastAsia="Yu Gothic"/>
-        </w:rPr>
-        <w:t>配布された「DigitalBuileder_GR」フォルダを開きます。</w:t>
-      </w:r>
-    </w:p>
-    <w:p>
-      <w:pPr>
-        <w:numPr>
-          <w:ilvl w:val="0"/>
-          <w:numId w:val="10"/>
-        </w:numPr>
-        <w:spacing w:after="80" w:line="300" w:lineRule="auto"/>
-      </w:pPr>
-      <w:r>
-        <w:rPr>
-          <w:rFonts w:ascii="Calibri" w:hAnsi="Calibri" w:eastAsia="Yu Gothic"/>
-        </w:rPr>
-        <w:t>DigitalBuileder_GR.exe をダブルクリックします。デスクトップに「電子請求書管理」ショートカットがある場合は、そちらから起動できます。</w:t>
-      </w:r>
-    </w:p>
-    <w:p>
-      <w:pPr>
-        <w:numPr>
-          <w:ilvl w:val="0"/>
-          <w:numId w:val="10"/>
-        </w:numPr>
-        <w:spacing w:after="80" w:line="300" w:lineRule="auto"/>
-      </w:pPr>
-      <w:r>
-        <w:rPr>
-          <w:rFonts w:ascii="Calibri" w:hAnsi="Calibri" w:eastAsia="Yu Gothic"/>
-        </w:rPr>
-        <w:t>最初に［請求一覧］画面が開いたことを確認します。</w:t>
-      </w:r>
-    </w:p>
+    <w:tbl>
+      <w:tblPr>
+        <w:tblStyle w:val="TableGrid"/>
+        <w:tblW w:type="dxa" w:w="9360"/>
+        <w:jc w:val="left"/>
+        <w:tblLayout w:type="fixed"/>
+        <w:tblLook w:firstColumn="1" w:firstRow="1" w:lastColumn="0" w:lastRow="0" w:noHBand="0" w:noVBand="1" w:val="04A0"/>
+        <w:tblInd w:w="120" w:type="dxa"/>
+      </w:tblPr>
+      <w:tblGrid>
+        <w:gridCol w:w="540"/>
+        <w:gridCol w:w="8820"/>
+      </w:tblGrid>
+      <w:tr>
+        <w:tc>
+          <w:tcPr>
+            <w:tcW w:type="dxa" w:w="540"/>
+            <w:vAlign w:val="center"/>
+            <w:shd w:fill="E8EEF5"/>
+            <w:tcMar>
+              <w:top w:w="80" w:type="dxa"/>
+              <w:bottom w:w="80" w:type="dxa"/>
+              <w:start w:w="120" w:type="dxa"/>
+              <w:end w:w="120" w:type="dxa"/>
+            </w:tcMar>
+          </w:tcPr>
+          <w:p>
+            <w:pPr>
+              <w:spacing w:after="0"/>
+              <w:jc w:val="center"/>
+            </w:pPr>
+            <w:r>
+              <w:rPr>
+                <w:rFonts w:ascii="Calibri" w:hAnsi="Calibri" w:eastAsia="Yu Gothic"/>
+                <w:b/>
+                <w:color w:val="0B2545"/>
+                <w:sz w:val="20"/>
+              </w:rPr>
+              <w:t>1</w:t>
+            </w:r>
+          </w:p>
+        </w:tc>
+        <w:tc>
+          <w:tcPr>
+            <w:tcW w:type="dxa" w:w="8820"/>
+            <w:vAlign w:val="center"/>
+            <w:tcMar>
+              <w:top w:w="80" w:type="dxa"/>
+              <w:bottom w:w="80" w:type="dxa"/>
+              <w:start w:w="120" w:type="dxa"/>
+              <w:end w:w="120" w:type="dxa"/>
+            </w:tcMar>
+          </w:tcPr>
+          <w:p>
+            <w:pPr>
+              <w:spacing w:after="0"/>
+            </w:pPr>
+            <w:r>
+              <w:rPr>
+                <w:rFonts w:ascii="Calibri" w:hAnsi="Calibri" w:eastAsia="Yu Gothic"/>
+                <w:sz w:val="20"/>
+              </w:rPr>
+              <w:t>「DigitalBuileder_GR」フォルダを開きます。</w:t>
+            </w:r>
+          </w:p>
+        </w:tc>
+      </w:tr>
+      <w:tr>
+        <w:tc>
+          <w:tcPr>
+            <w:tcW w:type="dxa" w:w="540"/>
+            <w:vAlign w:val="center"/>
+            <w:shd w:fill="E8EEF5"/>
+            <w:tcMar>
+              <w:top w:w="80" w:type="dxa"/>
+              <w:bottom w:w="80" w:type="dxa"/>
+              <w:start w:w="120" w:type="dxa"/>
+              <w:end w:w="120" w:type="dxa"/>
+            </w:tcMar>
+          </w:tcPr>
+          <w:p>
+            <w:pPr>
+              <w:spacing w:after="0"/>
+              <w:jc w:val="center"/>
+            </w:pPr>
+            <w:r>
+              <w:rPr>
+                <w:rFonts w:ascii="Calibri" w:hAnsi="Calibri" w:eastAsia="Yu Gothic"/>
+                <w:b/>
+                <w:color w:val="0B2545"/>
+                <w:sz w:val="20"/>
+              </w:rPr>
+              <w:t>2</w:t>
+            </w:r>
+          </w:p>
+        </w:tc>
+        <w:tc>
+          <w:tcPr>
+            <w:tcW w:type="dxa" w:w="8820"/>
+            <w:vAlign w:val="center"/>
+            <w:tcMar>
+              <w:top w:w="80" w:type="dxa"/>
+              <w:bottom w:w="80" w:type="dxa"/>
+              <w:start w:w="120" w:type="dxa"/>
+              <w:end w:w="120" w:type="dxa"/>
+            </w:tcMar>
+          </w:tcPr>
+          <w:p>
+            <w:pPr>
+              <w:spacing w:after="0"/>
+            </w:pPr>
+            <w:r>
+              <w:rPr>
+                <w:rFonts w:ascii="Calibri" w:hAnsi="Calibri" w:eastAsia="Yu Gothic"/>
+                <w:sz w:val="20"/>
+              </w:rPr>
+              <w:t>起動.bat をダブルクリックします。デスクトップに「電子請求書管理」ショートカットがある場合は、そちらから起動できます。</w:t>
+            </w:r>
+          </w:p>
+        </w:tc>
+      </w:tr>
+      <w:tr>
+        <w:tc>
+          <w:tcPr>
+            <w:tcW w:type="dxa" w:w="540"/>
+            <w:vAlign w:val="center"/>
+            <w:shd w:fill="E8EEF5"/>
+            <w:tcMar>
+              <w:top w:w="80" w:type="dxa"/>
+              <w:bottom w:w="80" w:type="dxa"/>
+              <w:start w:w="120" w:type="dxa"/>
+              <w:end w:w="120" w:type="dxa"/>
+            </w:tcMar>
+          </w:tcPr>
+          <w:p>
+            <w:pPr>
+              <w:spacing w:after="0"/>
+              <w:jc w:val="center"/>
+            </w:pPr>
+            <w:r>
+              <w:rPr>
+                <w:rFonts w:ascii="Calibri" w:hAnsi="Calibri" w:eastAsia="Yu Gothic"/>
+                <w:b/>
+                <w:color w:val="0B2545"/>
+                <w:sz w:val="20"/>
+              </w:rPr>
+              <w:t>3</w:t>
+            </w:r>
+          </w:p>
+        </w:tc>
+        <w:tc>
+          <w:tcPr>
+            <w:tcW w:type="dxa" w:w="8820"/>
+            <w:vAlign w:val="center"/>
+            <w:tcMar>
+              <w:top w:w="80" w:type="dxa"/>
+              <w:bottom w:w="80" w:type="dxa"/>
+              <w:start w:w="120" w:type="dxa"/>
+              <w:end w:w="120" w:type="dxa"/>
+            </w:tcMar>
+          </w:tcPr>
+          <w:p>
+            <w:pPr>
+              <w:spacing w:after="0"/>
+            </w:pPr>
+            <w:r>
+              <w:rPr>
+                <w:rFonts w:ascii="Calibri" w:hAnsi="Calibri" w:eastAsia="Yu Gothic"/>
+                <w:sz w:val="20"/>
+              </w:rPr>
+              <w:t>最初に［請求一覧］画面が開いたことを確認します。</w:t>
+            </w:r>
+          </w:p>
+        </w:tc>
+      </w:tr>
+    </w:tbl>
     <w:tbl>
       <w:tblPr>
         <w:tblW w:type="dxa" w:w="9360"/>
@@ -1214,7 +1332,7 @@
               <w:rPr>
                 <w:rFonts w:ascii="Calibri" w:hAnsi="Calibri" w:eastAsia="Yu Gothic"/>
               </w:rPr>
-              <w:t>DigitalBuileder_GR.exeだけを移動しないでください。_internalフォルダを含む配布フォルダ全体を同じ場所で使用します。</w:t>
+              <w:t>起動.bat、app.py、invoice_manager、assets、dataの配置を変えずに使用します。他PC向けexe配布版では、exeと_internalを同じフォルダに置きます。</w:t>
             </w:r>
           </w:p>
         </w:tc>
@@ -1315,7 +1433,7 @@
                 <w:rFonts w:ascii="Calibri" w:hAnsi="Calibri" w:eastAsia="Yu Gothic"/>
                 <w:sz w:val="19"/>
               </w:rPr>
-              <w:t>exeを開いても起動しない</w:t>
+              <w:t>起動.batを開いても起動しない</w:t>
             </w:r>
           </w:p>
         </w:tc>
@@ -1338,7 +1456,7 @@
                 <w:rFonts w:ascii="Calibri" w:hAnsi="Calibri" w:eastAsia="Yu Gothic"/>
                 <w:sz w:val="19"/>
               </w:rPr>
-              <w:t>exeと_internalが同じ配布フォルダにあるか確認</w:t>
+              <w:t>Python環境とフォルダ内のapp.pyを確認</w:t>
             </w:r>
           </w:p>
         </w:tc>
@@ -1434,7 +1552,7 @@
                 <w:rFonts w:ascii="Calibri" w:hAnsi="Calibri" w:eastAsia="Yu Gothic"/>
                 <w:sz w:val="19"/>
               </w:rPr>
-              <w:t>配布フォルダのexeから直接起動し、管理者へ連絡</w:t>
+              <w:t>起動.batから直接起動し、管理者へ連絡</w:t>
             </w:r>
           </w:p>
         </w:tc>
@@ -1453,15 +1571,12 @@
     <w:p>
       <w:pPr>
         <w:pStyle w:val="Heading1"/>
-        <w:pBdr>
-          <w:bottom w:val="single" w:sz="8" w:space="4" w:color="E8EEF5"/>
-        </w:pBdr>
       </w:pPr>
       <w:r>
         <w:rPr>
           <w:rFonts w:ascii="Calibri" w:hAnsi="Calibri" w:eastAsia="Yu Gothic"/>
           <w:b/>
-          <w:color w:val="2E74B5"/>
+          <w:color w:val="000000"/>
           <w:sz w:val="32"/>
         </w:rPr>
         <w:t>3  CSV＋zipを取り込む</w:t>
@@ -1535,12 +1650,17 @@
     </w:p>
     <w:p>
       <w:pPr>
-        <w:numPr>
-          <w:ilvl w:val="0"/>
-          <w:numId w:val="11"/>
-        </w:numPr>
         <w:spacing w:after="80" w:line="300" w:lineRule="auto"/>
+        <w:ind w:left="504" w:hanging="317"/>
       </w:pPr>
+      <w:r>
+        <w:rPr>
+          <w:rFonts w:ascii="Calibri" w:hAnsi="Calibri" w:eastAsia="Yu Gothic"/>
+          <w:b/>
+          <w:color w:val="0B2545"/>
+        </w:rPr>
+        <w:t xml:space="preserve">1. </w:t>
+      </w:r>
       <w:r>
         <w:rPr>
           <w:rFonts w:ascii="Calibri" w:hAnsi="Calibri" w:eastAsia="Yu Gothic"/>
@@ -1550,12 +1670,17 @@
     </w:p>
     <w:p>
       <w:pPr>
-        <w:numPr>
-          <w:ilvl w:val="0"/>
-          <w:numId w:val="11"/>
-        </w:numPr>
         <w:spacing w:after="80" w:line="300" w:lineRule="auto"/>
+        <w:ind w:left="504" w:hanging="317"/>
       </w:pPr>
+      <w:r>
+        <w:rPr>
+          <w:rFonts w:ascii="Calibri" w:hAnsi="Calibri" w:eastAsia="Yu Gothic"/>
+          <w:b/>
+          <w:color w:val="0B2545"/>
+        </w:rPr>
+        <w:t xml:space="preserve">2. </w:t>
+      </w:r>
       <w:r>
         <w:rPr>
           <w:rFonts w:ascii="Calibri" w:hAnsi="Calibri" w:eastAsia="Yu Gothic"/>
@@ -1565,12 +1690,17 @@
     </w:p>
     <w:p>
       <w:pPr>
-        <w:numPr>
-          <w:ilvl w:val="0"/>
-          <w:numId w:val="11"/>
-        </w:numPr>
         <w:spacing w:after="80" w:line="300" w:lineRule="auto"/>
+        <w:ind w:left="504" w:hanging="317"/>
       </w:pPr>
+      <w:r>
+        <w:rPr>
+          <w:rFonts w:ascii="Calibri" w:hAnsi="Calibri" w:eastAsia="Yu Gothic"/>
+          <w:b/>
+          <w:color w:val="0B2545"/>
+        </w:rPr>
+        <w:t xml:space="preserve">3. </w:t>
+      </w:r>
       <w:r>
         <w:rPr>
           <w:rFonts w:ascii="Calibri" w:hAnsi="Calibri" w:eastAsia="Yu Gothic"/>
@@ -1580,12 +1710,17 @@
     </w:p>
     <w:p>
       <w:pPr>
-        <w:numPr>
-          <w:ilvl w:val="0"/>
-          <w:numId w:val="11"/>
-        </w:numPr>
         <w:spacing w:after="80" w:line="300" w:lineRule="auto"/>
+        <w:ind w:left="504" w:hanging="317"/>
       </w:pPr>
+      <w:r>
+        <w:rPr>
+          <w:rFonts w:ascii="Calibri" w:hAnsi="Calibri" w:eastAsia="Yu Gothic"/>
+          <w:b/>
+          <w:color w:val="0B2545"/>
+        </w:rPr>
+        <w:t xml:space="preserve">4. </w:t>
+      </w:r>
       <w:r>
         <w:rPr>
           <w:rFonts w:ascii="Calibri" w:hAnsi="Calibri" w:eastAsia="Yu Gothic"/>
@@ -1595,12 +1730,17 @@
     </w:p>
     <w:p>
       <w:pPr>
-        <w:numPr>
-          <w:ilvl w:val="0"/>
-          <w:numId w:val="11"/>
-        </w:numPr>
         <w:spacing w:after="80" w:line="300" w:lineRule="auto"/>
+        <w:ind w:left="504" w:hanging="317"/>
       </w:pPr>
+      <w:r>
+        <w:rPr>
+          <w:rFonts w:ascii="Calibri" w:hAnsi="Calibri" w:eastAsia="Yu Gothic"/>
+          <w:b/>
+          <w:color w:val="0B2545"/>
+        </w:rPr>
+        <w:t xml:space="preserve">5. </w:t>
+      </w:r>
       <w:r>
         <w:rPr>
           <w:rFonts w:ascii="Calibri" w:hAnsi="Calibri" w:eastAsia="Yu Gothic"/>
@@ -1648,7 +1788,7 @@
               <w:rPr>
                 <w:rFonts w:ascii="Calibri" w:hAnsi="Calibri" w:eastAsia="Yu Gothic"/>
               </w:rPr>
-              <w:t>CSVの必須列は［請求金額(税込)］です。取込画面の［請求金額合計］も税込で、表示切替の対象外です。</w:t>
+              <w:t>CSVの必須列は［請求金額(税込)］です。取込画面の請求金額合計、工事別合計、取引先別合計は税抜で、表示切替の対象外です。</w:t>
             </w:r>
           </w:p>
         </w:tc>
@@ -1667,15 +1807,12 @@
     <w:p>
       <w:pPr>
         <w:pStyle w:val="Heading1"/>
-        <w:pBdr>
-          <w:bottom w:val="single" w:sz="8" w:space="4" w:color="E8EEF5"/>
-        </w:pBdr>
       </w:pPr>
       <w:r>
         <w:rPr>
           <w:rFonts w:ascii="Calibri" w:hAnsi="Calibri" w:eastAsia="Yu Gothic"/>
           <w:b/>
-          <w:color w:val="2E74B5"/>
+          <w:color w:val="000000"/>
           <w:sz w:val="32"/>
         </w:rPr>
         <w:t>4  請求一覧を確認する</w:t>
@@ -2204,15 +2341,12 @@
     <w:p>
       <w:pPr>
         <w:pStyle w:val="Heading1"/>
-        <w:pBdr>
-          <w:bottom w:val="single" w:sz="8" w:space="4" w:color="E8EEF5"/>
-        </w:pBdr>
       </w:pPr>
       <w:r>
         <w:rPr>
           <w:rFonts w:ascii="Calibri" w:hAnsi="Calibri" w:eastAsia="Yu Gothic"/>
           <w:b/>
-          <w:color w:val="2E74B5"/>
+          <w:color w:val="000000"/>
           <w:sz w:val="32"/>
         </w:rPr>
         <w:t>5  税抜／税込表示を切り替える</w:t>
@@ -2368,12 +2502,17 @@
     </w:tbl>
     <w:p>
       <w:pPr>
-        <w:numPr>
-          <w:ilvl w:val="0"/>
-          <w:numId w:val="12"/>
-        </w:numPr>
         <w:spacing w:after="80" w:line="300" w:lineRule="auto"/>
+        <w:ind w:left="504" w:hanging="317"/>
       </w:pPr>
+      <w:r>
+        <w:rPr>
+          <w:rFonts w:ascii="Calibri" w:hAnsi="Calibri" w:eastAsia="Yu Gothic"/>
+          <w:b/>
+          <w:color w:val="0B2545"/>
+        </w:rPr>
+        <w:t xml:space="preserve">1. </w:t>
+      </w:r>
       <w:r>
         <w:rPr>
           <w:rFonts w:ascii="Calibri" w:hAnsi="Calibri" w:eastAsia="Yu Gothic"/>
@@ -2383,12 +2522,17 @@
     </w:p>
     <w:p>
       <w:pPr>
-        <w:numPr>
-          <w:ilvl w:val="0"/>
-          <w:numId w:val="12"/>
-        </w:numPr>
         <w:spacing w:after="80" w:line="300" w:lineRule="auto"/>
+        <w:ind w:left="504" w:hanging="317"/>
       </w:pPr>
+      <w:r>
+        <w:rPr>
+          <w:rFonts w:ascii="Calibri" w:hAnsi="Calibri" w:eastAsia="Yu Gothic"/>
+          <w:b/>
+          <w:color w:val="0B2545"/>
+        </w:rPr>
+        <w:t xml:space="preserve">2. </w:t>
+      </w:r>
       <w:r>
         <w:rPr>
           <w:rFonts w:ascii="Calibri" w:hAnsi="Calibri" w:eastAsia="Yu Gothic"/>
@@ -2398,27 +2542,37 @@
     </w:p>
     <w:p>
       <w:pPr>
-        <w:numPr>
-          <w:ilvl w:val="0"/>
-          <w:numId w:val="12"/>
-        </w:numPr>
         <w:spacing w:after="80" w:line="300" w:lineRule="auto"/>
+        <w:ind w:left="504" w:hanging="317"/>
       </w:pPr>
       <w:r>
         <w:rPr>
           <w:rFonts w:ascii="Calibri" w:hAnsi="Calibri" w:eastAsia="Yu Gothic"/>
+          <w:b/>
+          <w:color w:val="0B2545"/>
         </w:rPr>
-        <w:t>開いている請求詳細の請求金額と工種コード別振分も同じ表示へ変わります。</w:t>
+        <w:t xml:space="preserve">3. </w:t>
+      </w:r>
+      <w:r>
+        <w:rPr>
+          <w:rFonts w:ascii="Calibri" w:hAnsi="Calibri" w:eastAsia="Yu Gothic"/>
+        </w:rPr>
+        <w:t>開いている請求詳細の請求金額と振分行も同じ表示へ変わります。振分合計、未振分額、超過額は常に税抜です。</w:t>
       </w:r>
     </w:p>
     <w:p>
       <w:pPr>
-        <w:numPr>
-          <w:ilvl w:val="0"/>
-          <w:numId w:val="12"/>
-        </w:numPr>
         <w:spacing w:after="80" w:line="300" w:lineRule="auto"/>
+        <w:ind w:left="504" w:hanging="317"/>
       </w:pPr>
+      <w:r>
+        <w:rPr>
+          <w:rFonts w:ascii="Calibri" w:hAnsi="Calibri" w:eastAsia="Yu Gothic"/>
+          <w:b/>
+          <w:color w:val="0B2545"/>
+        </w:rPr>
+        <w:t xml:space="preserve">4. </w:t>
+      </w:r>
       <w:r>
         <w:rPr>
           <w:rFonts w:ascii="Calibri" w:hAnsi="Calibri" w:eastAsia="Yu Gothic"/>
@@ -2774,7 +2928,7 @@
               <w:rPr>
                 <w:rFonts w:ascii="Calibri" w:hAnsi="Calibri" w:eastAsia="Yu Gothic"/>
               </w:rPr>
-              <w:t>工種コード別振分の追加・編集で入力する金額は税込です。CSV、DB、Excel出力、取込プレビューの金額も税込のままです。</w:t>
+              <w:t>工種コード別振分の追加・編集は税抜で入力します。DBは税抜計算額と互換用の税込額を保持し、Excelは従来どおり税込で出力します。</w:t>
             </w:r>
           </w:p>
         </w:tc>
@@ -2793,15 +2947,12 @@
     <w:p>
       <w:pPr>
         <w:pStyle w:val="Heading1"/>
-        <w:pBdr>
-          <w:bottom w:val="single" w:sz="8" w:space="4" w:color="E8EEF5"/>
-        </w:pBdr>
       </w:pPr>
       <w:r>
         <w:rPr>
           <w:rFonts w:ascii="Calibri" w:hAnsi="Calibri" w:eastAsia="Yu Gothic"/>
           <w:b/>
-          <w:color w:val="2E74B5"/>
+          <w:color w:val="000000"/>
           <w:sz w:val="32"/>
         </w:rPr>
         <w:t>6  請求詳細と工種コード別振分</w:t>
@@ -2883,12 +3034,17 @@
     </w:p>
     <w:p>
       <w:pPr>
-        <w:numPr>
-          <w:ilvl w:val="0"/>
-          <w:numId w:val="13"/>
-        </w:numPr>
         <w:spacing w:after="80" w:line="300" w:lineRule="auto"/>
+        <w:ind w:left="504" w:hanging="317"/>
       </w:pPr>
+      <w:r>
+        <w:rPr>
+          <w:rFonts w:ascii="Calibri" w:hAnsi="Calibri" w:eastAsia="Yu Gothic"/>
+          <w:b/>
+          <w:color w:val="0B2545"/>
+        </w:rPr>
+        <w:t xml:space="preserve">1. </w:t>
+      </w:r>
       <w:r>
         <w:rPr>
           <w:rFonts w:ascii="Calibri" w:hAnsi="Calibri" w:eastAsia="Yu Gothic"/>
@@ -2898,12 +3054,17 @@
     </w:p>
     <w:p>
       <w:pPr>
-        <w:numPr>
-          <w:ilvl w:val="0"/>
-          <w:numId w:val="13"/>
-        </w:numPr>
         <w:spacing w:after="80" w:line="300" w:lineRule="auto"/>
+        <w:ind w:left="504" w:hanging="317"/>
       </w:pPr>
+      <w:r>
+        <w:rPr>
+          <w:rFonts w:ascii="Calibri" w:hAnsi="Calibri" w:eastAsia="Yu Gothic"/>
+          <w:b/>
+          <w:color w:val="0B2545"/>
+        </w:rPr>
+        <w:t xml:space="preserve">2. </w:t>
+      </w:r>
       <w:r>
         <w:rPr>
           <w:rFonts w:ascii="Calibri" w:hAnsi="Calibri" w:eastAsia="Yu Gothic"/>
@@ -2913,27 +3074,37 @@
     </w:p>
     <w:p>
       <w:pPr>
-        <w:numPr>
-          <w:ilvl w:val="0"/>
-          <w:numId w:val="13"/>
-        </w:numPr>
         <w:spacing w:after="80" w:line="300" w:lineRule="auto"/>
+        <w:ind w:left="504" w:hanging="317"/>
       </w:pPr>
       <w:r>
         <w:rPr>
           <w:rFonts w:ascii="Calibri" w:hAnsi="Calibri" w:eastAsia="Yu Gothic"/>
+          <w:b/>
+          <w:color w:val="0B2545"/>
         </w:rPr>
-        <w:t>金額を税込で入力し、必要に応じてメモと並び順を設定して保存します。金額未確定なら空欄でも登録できます。</w:t>
+        <w:t xml:space="preserve">3. </w:t>
+      </w:r>
+      <w:r>
+        <w:rPr>
+          <w:rFonts w:ascii="Calibri" w:hAnsi="Calibri" w:eastAsia="Yu Gothic"/>
+        </w:rPr>
+        <w:t>金額を税抜で入力し、必要に応じてメモと並び順を設定して保存します。金額未確定なら空欄でも登録できます。</w:t>
       </w:r>
     </w:p>
     <w:p>
       <w:pPr>
-        <w:numPr>
-          <w:ilvl w:val="0"/>
-          <w:numId w:val="13"/>
-        </w:numPr>
         <w:spacing w:after="80" w:line="300" w:lineRule="auto"/>
+        <w:ind w:left="504" w:hanging="317"/>
       </w:pPr>
+      <w:r>
+        <w:rPr>
+          <w:rFonts w:ascii="Calibri" w:hAnsi="Calibri" w:eastAsia="Yu Gothic"/>
+          <w:b/>
+          <w:color w:val="0B2545"/>
+        </w:rPr>
+        <w:t xml:space="preserve">4. </w:t>
+      </w:r>
       <w:r>
         <w:rPr>
           <w:rFonts w:ascii="Calibri" w:hAnsi="Calibri" w:eastAsia="Yu Gothic"/>
@@ -2981,7 +3152,7 @@
               <w:rPr>
                 <w:rFonts w:ascii="Calibri" w:hAnsi="Calibri" w:eastAsia="Yu Gothic"/>
               </w:rPr>
-              <w:t>［請求金額］［振分合計］［未振分額］を確認します。振分が請求額を超えると［超過額］と警告が表示されます。</w:t>
+              <w:t>［請求金額(税抜)］［振分合計(税抜)］［未振分額］を確認します。振分が請求額を超えると［超過額］と警告が表示されます。</w:t>
             </w:r>
           </w:p>
         </w:tc>
@@ -3008,15 +3179,12 @@
     <w:p>
       <w:pPr>
         <w:pStyle w:val="Heading1"/>
-        <w:pBdr>
-          <w:bottom w:val="single" w:sz="8" w:space="4" w:color="E8EEF5"/>
-        </w:pBdr>
       </w:pPr>
       <w:r>
         <w:rPr>
           <w:rFonts w:ascii="Calibri" w:hAnsi="Calibri" w:eastAsia="Yu Gothic"/>
           <w:b/>
-          <w:color w:val="2E74B5"/>
+          <w:color w:val="000000"/>
           <w:sz w:val="32"/>
         </w:rPr>
         <w:t>7  PDFを確認し、マークを付ける</w:t>
@@ -3090,12 +3258,17 @@
     </w:p>
     <w:p>
       <w:pPr>
-        <w:numPr>
-          <w:ilvl w:val="0"/>
-          <w:numId w:val="14"/>
-        </w:numPr>
         <w:spacing w:after="80" w:line="300" w:lineRule="auto"/>
+        <w:ind w:left="504" w:hanging="317"/>
       </w:pPr>
+      <w:r>
+        <w:rPr>
+          <w:rFonts w:ascii="Calibri" w:hAnsi="Calibri" w:eastAsia="Yu Gothic"/>
+          <w:b/>
+          <w:color w:val="0B2545"/>
+        </w:rPr>
+        <w:t xml:space="preserve">1. </w:t>
+      </w:r>
       <w:r>
         <w:rPr>
           <w:rFonts w:ascii="Calibri" w:hAnsi="Calibri" w:eastAsia="Yu Gothic"/>
@@ -3105,12 +3278,17 @@
     </w:p>
     <w:p>
       <w:pPr>
-        <w:numPr>
-          <w:ilvl w:val="0"/>
-          <w:numId w:val="14"/>
-        </w:numPr>
         <w:spacing w:after="80" w:line="300" w:lineRule="auto"/>
+        <w:ind w:left="504" w:hanging="317"/>
       </w:pPr>
+      <w:r>
+        <w:rPr>
+          <w:rFonts w:ascii="Calibri" w:hAnsi="Calibri" w:eastAsia="Yu Gothic"/>
+          <w:b/>
+          <w:color w:val="0B2545"/>
+        </w:rPr>
+        <w:t xml:space="preserve">2. </w:t>
+      </w:r>
       <w:r>
         <w:rPr>
           <w:rFonts w:ascii="Calibri" w:hAnsi="Calibri" w:eastAsia="Yu Gothic"/>
@@ -3120,12 +3298,17 @@
     </w:p>
     <w:p>
       <w:pPr>
-        <w:numPr>
-          <w:ilvl w:val="0"/>
-          <w:numId w:val="14"/>
-        </w:numPr>
         <w:spacing w:after="80" w:line="300" w:lineRule="auto"/>
+        <w:ind w:left="504" w:hanging="317"/>
       </w:pPr>
+      <w:r>
+        <w:rPr>
+          <w:rFonts w:ascii="Calibri" w:hAnsi="Calibri" w:eastAsia="Yu Gothic"/>
+          <w:b/>
+          <w:color w:val="0B2545"/>
+        </w:rPr>
+        <w:t xml:space="preserve">3. </w:t>
+      </w:r>
       <w:r>
         <w:rPr>
           <w:rFonts w:ascii="Calibri" w:hAnsi="Calibri" w:eastAsia="Yu Gothic"/>
@@ -3135,12 +3318,17 @@
     </w:p>
     <w:p>
       <w:pPr>
-        <w:numPr>
-          <w:ilvl w:val="0"/>
-          <w:numId w:val="14"/>
-        </w:numPr>
         <w:spacing w:after="80" w:line="300" w:lineRule="auto"/>
+        <w:ind w:left="504" w:hanging="317"/>
       </w:pPr>
+      <w:r>
+        <w:rPr>
+          <w:rFonts w:ascii="Calibri" w:hAnsi="Calibri" w:eastAsia="Yu Gothic"/>
+          <w:b/>
+          <w:color w:val="0B2545"/>
+        </w:rPr>
+        <w:t xml:space="preserve">4. </w:t>
+      </w:r>
       <w:r>
         <w:rPr>
           <w:rFonts w:ascii="Calibri" w:hAnsi="Calibri" w:eastAsia="Yu Gothic"/>
@@ -3467,18 +3655,15 @@
     <w:p>
       <w:pPr>
         <w:pStyle w:val="Heading1"/>
-        <w:pBdr>
-          <w:bottom w:val="single" w:sz="8" w:space="4" w:color="E8EEF5"/>
-        </w:pBdr>
       </w:pPr>
       <w:r>
         <w:rPr>
           <w:rFonts w:ascii="Calibri" w:hAnsi="Calibri" w:eastAsia="Yu Gothic"/>
           <w:b/>
-          <w:color w:val="2E74B5"/>
+          <w:color w:val="000000"/>
           <w:sz w:val="32"/>
         </w:rPr>
-        <w:t>8  管理メニュー・Excel出力・終了</w:t>
+        <w:t>8  管理メニューと出力</w:t>
       </w:r>
     </w:p>
     <w:p>
@@ -3491,7 +3676,7 @@
           <w:color w:val="667085"/>
           <w:sz w:val="20"/>
         </w:rPr>
-        <w:t>マスタ管理と月別出力は管理メニューから行います</w:t>
+        <w:t>工事表示設定、マスタ管理、月別出力を行います</w:t>
       </w:r>
     </w:p>
     <w:tbl>
@@ -3524,7 +3709,7 @@
             <w:r>
               <w:drawing>
                 <wp:inline xmlns:a="http://schemas.openxmlformats.org/drawingml/2006/main" xmlns:pic="http://schemas.openxmlformats.org/drawingml/2006/picture">
-                  <wp:extent cx="2240280" cy="2026920"/>
+                  <wp:extent cx="2240280" cy="2346960"/>
                   <wp:docPr id="9" name="Picture 9"/>
                   <wp:cNvGraphicFramePr>
                     <a:graphicFrameLocks noChangeAspect="1"/>
@@ -3545,7 +3730,7 @@
                         <pic:spPr>
                           <a:xfrm>
                             <a:off x="0" y="0"/>
-                            <a:ext cx="2240280" cy="2026920"/>
+                            <a:ext cx="2240280" cy="2346960"/>
                           </a:xfrm>
                           <a:prstGeom prst="rect"/>
                         </pic:spPr>
@@ -3656,6 +3841,27 @@
                 <w:color w:val="1F4D78"/>
                 <w:sz w:val="19"/>
               </w:rPr>
+              <w:t xml:space="preserve">工事表示設定: </w:t>
+            </w:r>
+            <w:r>
+              <w:rPr>
+                <w:rFonts w:ascii="Calibri" w:hAnsi="Calibri" w:eastAsia="Yu Gothic"/>
+                <w:sz w:val="19"/>
+              </w:rPr>
+              <w:t>完了工事の非表示と再表示</w:t>
+            </w:r>
+          </w:p>
+          <w:p>
+            <w:pPr>
+              <w:spacing w:after="60"/>
+            </w:pPr>
+            <w:r>
+              <w:rPr>
+                <w:rFonts w:ascii="Calibri" w:hAnsi="Calibri" w:eastAsia="Yu Gothic"/>
+                <w:b/>
+                <w:color w:val="1F4D78"/>
+                <w:sz w:val="19"/>
+              </w:rPr>
               <w:t xml:space="preserve">Digital Billderを開く: </w:t>
             </w:r>
             <w:r>
@@ -3695,17 +3901,38 @@
         <w:pStyle w:val="Heading2"/>
       </w:pPr>
       <w:r>
+        <w:t>工事表示設定</w:t>
+      </w:r>
+    </w:p>
+    <w:p>
+      <w:r>
+        <w:rPr>
+          <w:rFonts w:ascii="Calibri" w:hAnsi="Calibri" w:eastAsia="Yu Gothic"/>
+        </w:rPr>
+        <w:t>更新が終了した工事のチェックを外すと、請求やPDFを削除せず請求一覧から非表示にできます。再びチェックすると表示へ戻ります。非表示工事へ新しい請求を取り込むと、その工事は自動で表示へ戻ります。</w:t>
+      </w:r>
+    </w:p>
+    <w:p>
+      <w:pPr>
+        <w:pStyle w:val="Heading2"/>
+      </w:pPr>
+      <w:r>
         <w:t>Excel出力</w:t>
       </w:r>
     </w:p>
     <w:p>
       <w:pPr>
-        <w:numPr>
-          <w:ilvl w:val="0"/>
-          <w:numId w:val="15"/>
-        </w:numPr>
         <w:spacing w:after="80" w:line="300" w:lineRule="auto"/>
+        <w:ind w:left="504" w:hanging="317"/>
       </w:pPr>
+      <w:r>
+        <w:rPr>
+          <w:rFonts w:ascii="Calibri" w:hAnsi="Calibri" w:eastAsia="Yu Gothic"/>
+          <w:b/>
+          <w:color w:val="0B2545"/>
+        </w:rPr>
+        <w:t xml:space="preserve">1. </w:t>
+      </w:r>
       <w:r>
         <w:rPr>
           <w:rFonts w:ascii="Calibri" w:hAnsi="Calibri" w:eastAsia="Yu Gothic"/>
@@ -3715,12 +3942,17 @@
     </w:p>
     <w:p>
       <w:pPr>
-        <w:numPr>
-          <w:ilvl w:val="0"/>
-          <w:numId w:val="15"/>
-        </w:numPr>
         <w:spacing w:after="80" w:line="300" w:lineRule="auto"/>
+        <w:ind w:left="504" w:hanging="317"/>
       </w:pPr>
+      <w:r>
+        <w:rPr>
+          <w:rFonts w:ascii="Calibri" w:hAnsi="Calibri" w:eastAsia="Yu Gothic"/>
+          <w:b/>
+          <w:color w:val="0B2545"/>
+        </w:rPr>
+        <w:t xml:space="preserve">2. </w:t>
+      </w:r>
       <w:r>
         <w:rPr>
           <w:rFonts w:ascii="Calibri" w:hAnsi="Calibri" w:eastAsia="Yu Gothic"/>
@@ -3730,12 +3962,17 @@
     </w:p>
     <w:p>
       <w:pPr>
-        <w:numPr>
-          <w:ilvl w:val="0"/>
-          <w:numId w:val="15"/>
-        </w:numPr>
         <w:spacing w:after="80" w:line="300" w:lineRule="auto"/>
+        <w:ind w:left="504" w:hanging="317"/>
       </w:pPr>
+      <w:r>
+        <w:rPr>
+          <w:rFonts w:ascii="Calibri" w:hAnsi="Calibri" w:eastAsia="Yu Gothic"/>
+          <w:b/>
+          <w:color w:val="0B2545"/>
+        </w:rPr>
+        <w:t xml:space="preserve">3. </w:t>
+      </w:r>
       <w:r>
         <w:rPr>
           <w:rFonts w:ascii="Calibri" w:hAnsi="Calibri" w:eastAsia="Yu Gothic"/>
@@ -3791,22 +4028,6 @@
     </w:tbl>
     <w:p>
       <w:pPr>
-        <w:pStyle w:val="Heading2"/>
-      </w:pPr>
-      <w:r>
-        <w:t>終了</w:t>
-      </w:r>
-    </w:p>
-    <w:p>
-      <w:r>
-        <w:rPr>
-          <w:rFonts w:ascii="Calibri" w:hAnsi="Calibri" w:eastAsia="Yu Gothic"/>
-        </w:rPr>
-        <w:t>請求一覧右上の［×］でウィンドウを閉じると、アプリ全体が終了します。保存ダイアログが開いている場合は、先に処理を完了またはキャンセルしてください。</w:t>
-      </w:r>
-    </w:p>
-    <w:p>
-      <w:pPr>
         <w:sectPr>
           <w:pgSz w:w="12240" w:h="15840"/>
           <w:pgMar w:top="1440" w:right="1440" w:bottom="1440" w:left="1440" w:header="708" w:footer="708" w:gutter="0"/>
@@ -3818,15 +4039,12 @@
     <w:p>
       <w:pPr>
         <w:pStyle w:val="Heading1"/>
-        <w:pBdr>
-          <w:bottom w:val="single" w:sz="8" w:space="4" w:color="E8EEF5"/>
-        </w:pBdr>
       </w:pPr>
       <w:r>
         <w:rPr>
           <w:rFonts w:ascii="Calibri" w:hAnsi="Calibri" w:eastAsia="Yu Gothic"/>
           <w:b/>
-          <w:color w:val="2E74B5"/>
+          <w:color w:val="000000"/>
           <w:sz w:val="32"/>
         </w:rPr>
         <w:t>9  困ったとき・安全運用</w:t>
@@ -4076,6 +4294,54 @@
                 <w:rFonts w:ascii="Calibri" w:hAnsi="Calibri" w:eastAsia="Yu Gothic"/>
                 <w:sz w:val="19"/>
               </w:rPr>
+              <w:t>新規工事が選択肢にない</w:t>
+            </w:r>
+          </w:p>
+        </w:tc>
+        <w:tc>
+          <w:tcPr>
+            <w:tcW w:type="dxa" w:w="6260"/>
+            <w:tcMar>
+              <w:top w:w="80" w:type="dxa"/>
+              <w:bottom w:w="80" w:type="dxa"/>
+              <w:start w:w="120" w:type="dxa"/>
+              <w:end w:w="120" w:type="dxa"/>
+            </w:tcMar>
+          </w:tcPr>
+          <w:p>
+            <w:pPr>
+              <w:spacing w:after="0"/>
+            </w:pPr>
+            <w:r>
+              <w:rPr>
+                <w:rFonts w:ascii="Calibri" w:hAnsi="Calibri" w:eastAsia="Yu Gothic"/>
+                <w:sz w:val="19"/>
+              </w:rPr>
+              <w:t>取込画面と管理メニューを閉じて請求一覧へ戻ります</w:t>
+            </w:r>
+          </w:p>
+        </w:tc>
+      </w:tr>
+      <w:tr>
+        <w:tc>
+          <w:tcPr>
+            <w:tcW w:type="dxa" w:w="3100"/>
+            <w:tcMar>
+              <w:top w:w="80" w:type="dxa"/>
+              <w:bottom w:w="80" w:type="dxa"/>
+              <w:start w:w="120" w:type="dxa"/>
+              <w:end w:w="120" w:type="dxa"/>
+            </w:tcMar>
+          </w:tcPr>
+          <w:p>
+            <w:pPr>
+              <w:spacing w:after="0"/>
+            </w:pPr>
+            <w:r>
+              <w:rPr>
+                <w:rFonts w:ascii="Calibri" w:hAnsi="Calibri" w:eastAsia="Yu Gothic"/>
+                <w:sz w:val="19"/>
+              </w:rPr>
               <w:t>PDFが表示されない</w:t>
             </w:r>
           </w:p>
@@ -4271,7 +4537,7 @@
                 <w:rFonts w:ascii="Calibri" w:hAnsi="Calibri" w:eastAsia="Yu Gothic"/>
                 <w:sz w:val="20"/>
               </w:rPr>
-              <w:t>配布フォルダ内のexeと_internalを分離・削除しません。</w:t>
+              <w:t>起動.bat、app.py、invoice_manager、assets、dataの配置を変えません。</w:t>
             </w:r>
           </w:p>
         </w:tc>
@@ -4492,48 +4758,56 @@
           </w:p>
         </w:tc>
       </w:tr>
-    </w:tbl>
-    <w:tbl>
-      <w:tblPr>
-        <w:tblW w:type="dxa" w:w="9360"/>
-        <w:jc w:val="left"/>
-        <w:tblLayout w:type="fixed"/>
-        <w:tblLook w:firstColumn="1" w:firstRow="1" w:lastColumn="0" w:lastRow="0" w:noHBand="0" w:noVBand="1" w:val="04A0"/>
-        <w:tblInd w:w="120" w:type="dxa"/>
-      </w:tblPr>
-      <w:tblGrid>
-        <w:gridCol w:w="9360"/>
-      </w:tblGrid>
       <w:tr>
         <w:tc>
           <w:tcPr>
-            <w:tcW w:type="dxa" w:w="9360"/>
+            <w:tcW w:type="dxa" w:w="540"/>
+            <w:vAlign w:val="center"/>
+            <w:shd w:fill="F4F6F9"/>
             <w:tcMar>
               <w:top w:w="80" w:type="dxa"/>
               <w:bottom w:w="80" w:type="dxa"/>
               <w:start w:w="120" w:type="dxa"/>
               <w:end w:w="120" w:type="dxa"/>
             </w:tcMar>
-            <w:shd w:fill="F4F6F9"/>
-            <w:vAlign w:val="center"/>
           </w:tcPr>
           <w:p>
             <w:pPr>
-              <w:spacing w:before="80" w:after="80"/>
+              <w:spacing w:after="0"/>
+              <w:jc w:val="center"/>
             </w:pPr>
             <w:r>
               <w:rPr>
                 <w:rFonts w:ascii="Calibri" w:hAnsi="Calibri" w:eastAsia="Yu Gothic"/>
                 <w:b/>
-                <w:color w:val="1F4D78"/>
+                <w:color w:val="009C9A"/>
+                <w:sz w:val="22"/>
               </w:rPr>
-              <w:t xml:space="preserve">月次作業の最後に  </w:t>
+              <w:t>✓</w:t>
             </w:r>
+          </w:p>
+        </w:tc>
+        <w:tc>
+          <w:tcPr>
+            <w:tcW w:type="dxa" w:w="8820"/>
+            <w:vAlign w:val="center"/>
+            <w:tcMar>
+              <w:top w:w="80" w:type="dxa"/>
+              <w:bottom w:w="80" w:type="dxa"/>
+              <w:start w:w="120" w:type="dxa"/>
+              <w:end w:w="120" w:type="dxa"/>
+            </w:tcMar>
+          </w:tcPr>
+          <w:p>
+            <w:pPr>
+              <w:spacing w:after="0"/>
+            </w:pPr>
             <w:r>
               <w:rPr>
                 <w:rFonts w:ascii="Calibri" w:hAnsi="Calibri" w:eastAsia="Yu Gothic"/>
+                <w:sz w:val="20"/>
               </w:rPr>
-              <w:t>表示件数・合計額・未振分額・エラー件数を確認し、必要なExcelと確認用PDFが出力できていることを確認してください。</w:t>
+              <w:t>終了するときは請求一覧右上の［×］を押します。保存ダイアログが開いている場合は、先に完了またはキャンセルします。</w:t>
             </w:r>
           </w:p>
         </w:tc>
@@ -4825,144 +5099,6 @@
   </w:num>
   <w:num w:numId="9">
     <w:abstractNumId w:val="0"/>
-  </w:num>
-  <w:abstractNum xmlns:ns0="http://schemas.microsoft.com/office/word/2012/wordml" w:abstractNumId="9" ns0:restartNumberingAfterBreak="1">
-    <w:nsid w:val="A17B0009"/>
-    <w:multiLevelType w:val="singleLevel"/>
-    <w:lvl w:ilvl="0">
-      <w:start w:val="1"/>
-      <w:numFmt w:val="decimal"/>
-      <w:lvlText w:val="%1."/>
-      <w:suff w:val="tab"/>
-      <w:pPr>
-        <w:tabs>
-          <w:tab w:val="num" w:pos="540"/>
-        </w:tabs>
-        <w:ind w:left="540" w:hanging="271"/>
-        <w:spacing w:after="80" w:line="300" w:lineRule="auto"/>
-      </w:pPr>
-    </w:lvl>
-  </w:abstractNum>
-  <w:num w:numId="10">
-    <w:abstractNumId w:val="9"/>
-    <w:lvlOverride w:ilvl="0">
-      <w:startOverride w:val="1"/>
-    </w:lvlOverride>
-  </w:num>
-  <w:abstractNum xmlns:ns0="http://schemas.microsoft.com/office/word/2012/wordml" w:abstractNumId="10" ns0:restartNumberingAfterBreak="1">
-    <w:nsid w:val="A17B000A"/>
-    <w:multiLevelType w:val="singleLevel"/>
-    <w:lvl w:ilvl="0">
-      <w:start w:val="1"/>
-      <w:numFmt w:val="decimal"/>
-      <w:lvlText w:val="%1."/>
-      <w:suff w:val="tab"/>
-      <w:pPr>
-        <w:tabs>
-          <w:tab w:val="num" w:pos="540"/>
-        </w:tabs>
-        <w:ind w:left="540" w:hanging="271"/>
-        <w:spacing w:after="80" w:line="300" w:lineRule="auto"/>
-      </w:pPr>
-    </w:lvl>
-  </w:abstractNum>
-  <w:num w:numId="11">
-    <w:abstractNumId w:val="10"/>
-    <w:lvlOverride w:ilvl="0">
-      <w:startOverride w:val="1"/>
-    </w:lvlOverride>
-  </w:num>
-  <w:abstractNum xmlns:ns0="http://schemas.microsoft.com/office/word/2012/wordml" w:abstractNumId="11" ns0:restartNumberingAfterBreak="1">
-    <w:nsid w:val="A17B000B"/>
-    <w:multiLevelType w:val="singleLevel"/>
-    <w:lvl w:ilvl="0">
-      <w:start w:val="1"/>
-      <w:numFmt w:val="decimal"/>
-      <w:lvlText w:val="%1."/>
-      <w:suff w:val="tab"/>
-      <w:pPr>
-        <w:tabs>
-          <w:tab w:val="num" w:pos="540"/>
-        </w:tabs>
-        <w:ind w:left="540" w:hanging="271"/>
-        <w:spacing w:after="80" w:line="300" w:lineRule="auto"/>
-      </w:pPr>
-    </w:lvl>
-  </w:abstractNum>
-  <w:num w:numId="12">
-    <w:abstractNumId w:val="11"/>
-    <w:lvlOverride w:ilvl="0">
-      <w:startOverride w:val="1"/>
-    </w:lvlOverride>
-  </w:num>
-  <w:abstractNum xmlns:ns0="http://schemas.microsoft.com/office/word/2012/wordml" w:abstractNumId="12" ns0:restartNumberingAfterBreak="1">
-    <w:nsid w:val="A17B000C"/>
-    <w:multiLevelType w:val="singleLevel"/>
-    <w:lvl w:ilvl="0">
-      <w:start w:val="1"/>
-      <w:numFmt w:val="decimal"/>
-      <w:lvlText w:val="%1."/>
-      <w:suff w:val="tab"/>
-      <w:pPr>
-        <w:tabs>
-          <w:tab w:val="num" w:pos="540"/>
-        </w:tabs>
-        <w:ind w:left="540" w:hanging="271"/>
-        <w:spacing w:after="80" w:line="300" w:lineRule="auto"/>
-      </w:pPr>
-    </w:lvl>
-  </w:abstractNum>
-  <w:num w:numId="13">
-    <w:abstractNumId w:val="12"/>
-    <w:lvlOverride w:ilvl="0">
-      <w:startOverride w:val="1"/>
-    </w:lvlOverride>
-  </w:num>
-  <w:abstractNum xmlns:ns0="http://schemas.microsoft.com/office/word/2012/wordml" w:abstractNumId="13" ns0:restartNumberingAfterBreak="1">
-    <w:nsid w:val="A17B000D"/>
-    <w:multiLevelType w:val="singleLevel"/>
-    <w:lvl w:ilvl="0">
-      <w:start w:val="1"/>
-      <w:numFmt w:val="decimal"/>
-      <w:lvlText w:val="%1."/>
-      <w:suff w:val="tab"/>
-      <w:pPr>
-        <w:tabs>
-          <w:tab w:val="num" w:pos="540"/>
-        </w:tabs>
-        <w:ind w:left="540" w:hanging="271"/>
-        <w:spacing w:after="80" w:line="300" w:lineRule="auto"/>
-      </w:pPr>
-    </w:lvl>
-  </w:abstractNum>
-  <w:num w:numId="14">
-    <w:abstractNumId w:val="13"/>
-    <w:lvlOverride w:ilvl="0">
-      <w:startOverride w:val="1"/>
-    </w:lvlOverride>
-  </w:num>
-  <w:abstractNum xmlns:ns0="http://schemas.microsoft.com/office/word/2012/wordml" w:abstractNumId="14" ns0:restartNumberingAfterBreak="1">
-    <w:nsid w:val="A17B000E"/>
-    <w:multiLevelType w:val="singleLevel"/>
-    <w:lvl w:ilvl="0">
-      <w:start w:val="1"/>
-      <w:numFmt w:val="decimal"/>
-      <w:lvlText w:val="%1."/>
-      <w:suff w:val="tab"/>
-      <w:pPr>
-        <w:tabs>
-          <w:tab w:val="num" w:pos="540"/>
-        </w:tabs>
-        <w:ind w:left="540" w:hanging="271"/>
-        <w:spacing w:after="80" w:line="300" w:lineRule="auto"/>
-      </w:pPr>
-    </w:lvl>
-  </w:abstractNum>
-  <w:num w:numId="15">
-    <w:abstractNumId w:val="14"/>
-    <w:lvlOverride w:ilvl="0">
-      <w:startOverride w:val="1"/>
-    </w:lvlOverride>
   </w:num>
 </w:numbering>
 </file>
@@ -5197,7 +5333,7 @@
       <w:rFonts w:asciiTheme="majorHAnsi" w:eastAsiaTheme="majorEastAsia" w:hAnsiTheme="majorHAnsi" w:cstheme="majorBidi" w:ascii="Calibri" w:hAnsi="Calibri" w:eastAsia="Yu Gothic"/>
       <w:b/>
       <w:bCs/>
-      <w:color w:val="2E74B5"/>
+      <w:color w:val="000000"/>
       <w:sz w:val="32"/>
       <w:szCs w:val="28"/>
     </w:rPr>
@@ -5221,7 +5357,7 @@
       <w:rFonts w:asciiTheme="majorHAnsi" w:eastAsiaTheme="majorEastAsia" w:hAnsiTheme="majorHAnsi" w:cstheme="majorBidi" w:ascii="Calibri" w:hAnsi="Calibri" w:eastAsia="Yu Gothic"/>
       <w:b/>
       <w:bCs/>
-      <w:color w:val="2E74B5"/>
+      <w:color w:val="000000"/>
       <w:sz w:val="26"/>
       <w:szCs w:val="26"/>
     </w:rPr>
@@ -5245,7 +5381,7 @@
       <w:rFonts w:asciiTheme="majorHAnsi" w:eastAsiaTheme="majorEastAsia" w:hAnsiTheme="majorHAnsi" w:cstheme="majorBidi" w:ascii="Calibri" w:hAnsi="Calibri" w:eastAsia="Yu Gothic"/>
       <w:b/>
       <w:bCs/>
-      <w:color w:val="1F4D78"/>
+      <w:color w:val="000000"/>
       <w:sz w:val="24"/>
     </w:rPr>
   </w:style>
@@ -5477,15 +5613,12 @@
     <w:qFormat/>
     <w:rsid w:val="00FC693F"/>
     <w:pPr>
-      <w:pBdr>
-        <w:bottom w:val="single" w:sz="8" w:space="4" w:color="4F81BD" w:themeColor="accent1"/>
-      </w:pBdr>
       <w:spacing w:after="300" w:line="240" w:lineRule="auto"/>
       <w:contextualSpacing/>
     </w:pPr>
     <w:rPr>
       <w:rFonts w:asciiTheme="majorHAnsi" w:eastAsiaTheme="majorEastAsia" w:hAnsiTheme="majorHAnsi" w:cstheme="majorBidi"/>
-      <w:color w:val="17365D" w:themeColor="text2" w:themeShade="BF"/>
+      <w:color w:val="000000"/>
       <w:spacing w:val="5"/>
       <w:kern w:val="28"/>
       <w:sz w:val="52"/>

</xml_diff>

<commit_message>
Update manuals for archive and history workflows
</commit_message>
<xml_diff>
--- a/docs/電子請求書管理_操作マニュアル.docx
+++ b/docs/電子請求書管理_操作マニュアル.docx
@@ -132,7 +132,7 @@
           <w:color w:val="667085"/>
           <w:sz w:val="20"/>
         </w:rPr>
-        <w:t>CSV＋zip取込 / 請求一覧 / 税表示切替 / 工種振分 / 工事表示 / PDF確認 / Excel出力</w:t>
+        <w:t>CSV＋zip取込 / 取込履歴 / 請求一覧 / 税表示切替 / 工種振分 / 工事表示 / PDF確認 / Excel出力</w:t>
       </w:r>
     </w:p>
     <w:p>
@@ -360,7 +360,7 @@
                 <w:rFonts w:ascii="Calibri" w:hAnsi="Calibri" w:eastAsia="Yu Gothic"/>
                 <w:sz w:val="20"/>
               </w:rPr>
-              <w:t>請求一覧を工事・請求月・取引先・請求日で絞り込み、詳細やPDFを確認します。</w:t>
+              <w:t>請求一覧を工事・請求月・取引先・請求日で絞り込み、詳細・PDF・取込履歴を確認します。</w:t>
             </w:r>
           </w:p>
         </w:tc>
@@ -415,6 +415,60 @@
                 <w:sz w:val="20"/>
               </w:rPr>
               <w:t>請求金額を工種コード別に振り分け、PDFへ確認用マークを配置します。</w:t>
+            </w:r>
+          </w:p>
+        </w:tc>
+      </w:tr>
+      <w:tr>
+        <w:tc>
+          <w:tcPr>
+            <w:tcW w:type="dxa" w:w="540"/>
+            <w:vAlign w:val="center"/>
+            <w:shd w:fill="F4F6F9"/>
+            <w:tcMar>
+              <w:top w:w="80" w:type="dxa"/>
+              <w:bottom w:w="80" w:type="dxa"/>
+              <w:start w:w="120" w:type="dxa"/>
+              <w:end w:w="120" w:type="dxa"/>
+            </w:tcMar>
+          </w:tcPr>
+          <w:p>
+            <w:pPr>
+              <w:spacing w:after="0"/>
+              <w:jc w:val="center"/>
+            </w:pPr>
+            <w:r>
+              <w:rPr>
+                <w:rFonts w:ascii="Calibri" w:hAnsi="Calibri" w:eastAsia="Yu Gothic"/>
+                <w:b/>
+                <w:color w:val="009C9A"/>
+                <w:sz w:val="22"/>
+              </w:rPr>
+              <w:t>✓</w:t>
+            </w:r>
+          </w:p>
+        </w:tc>
+        <w:tc>
+          <w:tcPr>
+            <w:tcW w:type="dxa" w:w="8820"/>
+            <w:vAlign w:val="center"/>
+            <w:tcMar>
+              <w:top w:w="80" w:type="dxa"/>
+              <w:bottom w:w="80" w:type="dxa"/>
+              <w:start w:w="120" w:type="dxa"/>
+              <w:end w:w="120" w:type="dxa"/>
+            </w:tcMar>
+          </w:tcPr>
+          <w:p>
+            <w:pPr>
+              <w:spacing w:after="0"/>
+            </w:pPr>
+            <w:r>
+              <w:rPr>
+                <w:rFonts w:ascii="Calibri" w:hAnsi="Calibri" w:eastAsia="Yu Gothic"/>
+                <w:sz w:val="20"/>
+              </w:rPr>
+              <w:t>完了工事はアーカイブして、自動処理と変更の対象から外します。</w:t>
             </w:r>
           </w:p>
         </w:tc>
@@ -977,54 +1031,6 @@
           </w:p>
         </w:tc>
       </w:tr>
-      <w:tr>
-        <w:tc>
-          <w:tcPr>
-            <w:tcW w:type="dxa" w:w="2700"/>
-            <w:tcMar>
-              <w:top w:w="80" w:type="dxa"/>
-              <w:bottom w:w="80" w:type="dxa"/>
-              <w:start w:w="120" w:type="dxa"/>
-              <w:end w:w="120" w:type="dxa"/>
-            </w:tcMar>
-          </w:tcPr>
-          <w:p>
-            <w:pPr>
-              <w:spacing w:after="0"/>
-            </w:pPr>
-            <w:r>
-              <w:rPr>
-                <w:rFonts w:ascii="Calibri" w:hAnsi="Calibri" w:eastAsia="Yu Gothic"/>
-                <w:sz w:val="19"/>
-              </w:rPr>
-              <w:t>金額データ</w:t>
-            </w:r>
-          </w:p>
-        </w:tc>
-        <w:tc>
-          <w:tcPr>
-            <w:tcW w:type="dxa" w:w="6660"/>
-            <w:tcMar>
-              <w:top w:w="80" w:type="dxa"/>
-              <w:bottom w:w="80" w:type="dxa"/>
-              <w:start w:w="120" w:type="dxa"/>
-              <w:end w:w="120" w:type="dxa"/>
-            </w:tcMar>
-          </w:tcPr>
-          <w:p>
-            <w:pPr>
-              <w:spacing w:after="0"/>
-            </w:pPr>
-            <w:r>
-              <w:rPr>
-                <w:rFonts w:ascii="Calibri" w:hAnsi="Calibri" w:eastAsia="Yu Gothic"/>
-                <w:sz w:val="19"/>
-              </w:rPr>
-              <w:t>CSVとExcelは税込。DBは税込原本額と税抜計算額を保持</w:t>
-            </w:r>
-          </w:p>
-        </w:tc>
-      </w:tr>
     </w:tbl>
     <w:p>
       <w:pPr>
@@ -1332,7 +1338,7 @@
               <w:rPr>
                 <w:rFonts w:ascii="Calibri" w:hAnsi="Calibri" w:eastAsia="Yu Gothic"/>
               </w:rPr>
-              <w:t>起動.bat、app.py、invoice_manager、assets、dataの配置を変えずに使用します。他PC向けexe配布版では、exeと_internalを同じフォルダに置きます。</w:t>
+              <w:t>起動.bat、app.py、invoice_manager、assets、dataの配置を変えずに使用します。現行運用はEXEではなく、起動.batから開始します。</w:t>
             </w:r>
           </w:p>
         </w:tc>
@@ -1725,7 +1731,7 @@
         <w:rPr>
           <w:rFonts w:ascii="Calibri" w:hAnsi="Calibri" w:eastAsia="Yu Gothic"/>
         </w:rPr>
-        <w:t>［プレビュー］を押し、一致件数・新規件数・重複候補・エラー件数を確認します。</w:t>
+        <w:t>［プレビュー］を押し、一致件数・新規件数・重複候補・エラー件数を確認します。CSVの必須列は［請求金額(税込)］で、画面の金額集計は税抜です。</w:t>
       </w:r>
     </w:p>
     <w:p>
@@ -1745,55 +1751,29 @@
         <w:rPr>
           <w:rFonts w:ascii="Calibri" w:hAnsi="Calibri" w:eastAsia="Yu Gothic"/>
         </w:rPr>
+        <w:t>アーカイブ工事スキップ件数がある場合は、対象工事を確認します。アーカイブ中の工事は自動で表示へ戻りません。</w:t>
+      </w:r>
+    </w:p>
+    <w:p>
+      <w:pPr>
+        <w:spacing w:after="80" w:line="300" w:lineRule="auto"/>
+        <w:ind w:left="504" w:hanging="317"/>
+      </w:pPr>
+      <w:r>
+        <w:rPr>
+          <w:rFonts w:ascii="Calibri" w:hAnsi="Calibri" w:eastAsia="Yu Gothic"/>
+          <w:b/>
+          <w:color w:val="0B2545"/>
+        </w:rPr>
+        <w:t xml:space="preserve">6. </w:t>
+      </w:r>
+      <w:r>
+        <w:rPr>
+          <w:rFonts w:ascii="Calibri" w:hAnsi="Calibri" w:eastAsia="Yu Gothic"/>
+        </w:rPr>
         <w:t>問題がなければ［取込実行］を押し、確認ダイアログで実行します。</w:t>
       </w:r>
     </w:p>
-    <w:tbl>
-      <w:tblPr>
-        <w:tblW w:type="dxa" w:w="9360"/>
-        <w:jc w:val="left"/>
-        <w:tblLayout w:type="fixed"/>
-        <w:tblLook w:firstColumn="1" w:firstRow="1" w:lastColumn="0" w:lastRow="0" w:noHBand="0" w:noVBand="1" w:val="04A0"/>
-        <w:tblInd w:w="120" w:type="dxa"/>
-      </w:tblPr>
-      <w:tblGrid>
-        <w:gridCol w:w="9360"/>
-      </w:tblGrid>
-      <w:tr>
-        <w:tc>
-          <w:tcPr>
-            <w:tcW w:type="dxa" w:w="9360"/>
-            <w:tcMar>
-              <w:top w:w="80" w:type="dxa"/>
-              <w:bottom w:w="80" w:type="dxa"/>
-              <w:start w:w="120" w:type="dxa"/>
-              <w:end w:w="120" w:type="dxa"/>
-            </w:tcMar>
-            <w:shd w:fill="FFF8E8"/>
-            <w:vAlign w:val="center"/>
-          </w:tcPr>
-          <w:p>
-            <w:pPr>
-              <w:spacing w:before="80" w:after="80"/>
-            </w:pPr>
-            <w:r>
-              <w:rPr>
-                <w:rFonts w:ascii="Calibri" w:hAnsi="Calibri" w:eastAsia="Yu Gothic"/>
-                <w:b/>
-                <w:color w:val="7A5A00"/>
-              </w:rPr>
-              <w:t xml:space="preserve">金額の扱い  </w:t>
-            </w:r>
-            <w:r>
-              <w:rPr>
-                <w:rFonts w:ascii="Calibri" w:hAnsi="Calibri" w:eastAsia="Yu Gothic"/>
-              </w:rPr>
-              <w:t>CSVの必須列は［請求金額(税込)］です。取込画面の請求金額合計、工事別合計、取引先別合計は税抜で、表示切替の対象外です。</w:t>
-            </w:r>
-          </w:p>
-        </w:tc>
-      </w:tr>
-    </w:tbl>
     <w:p>
       <w:pPr>
         <w:sectPr>
@@ -2322,7 +2302,7 @@
                 <w:rFonts w:ascii="Calibri" w:hAnsi="Calibri" w:eastAsia="Yu Gothic"/>
                 <w:sz w:val="20"/>
               </w:rPr>
-              <w:t>［請求月一括再計算(テスト)］は試験用です。通常作業では使用しません。</w:t>
+              <w:t>［選択工事の請求月再計算(試験)］は、工事を1件選んだ場合だけ実行できます。手動補正した請求月は変更しません。</w:t>
             </w:r>
           </w:p>
         </w:tc>
@@ -3676,7 +3656,7 @@
           <w:color w:val="667085"/>
           <w:sz w:val="20"/>
         </w:rPr>
-        <w:t>工事表示設定、マスタ管理、月別出力を行います</w:t>
+        <w:t>取込履歴、工事アーカイブ、マスタ管理、月別出力を行います</w:t>
       </w:r>
     </w:p>
     <w:tbl>
@@ -3709,7 +3689,7 @@
             <w:r>
               <w:drawing>
                 <wp:inline xmlns:a="http://schemas.openxmlformats.org/drawingml/2006/main" xmlns:pic="http://schemas.openxmlformats.org/drawingml/2006/picture">
-                  <wp:extent cx="2240280" cy="2346960"/>
+                  <wp:extent cx="2240280" cy="2613660"/>
                   <wp:docPr id="9" name="Picture 9"/>
                   <wp:cNvGraphicFramePr>
                     <a:graphicFrameLocks noChangeAspect="1"/>
@@ -3730,7 +3710,7 @@
                         <pic:spPr>
                           <a:xfrm>
                             <a:off x="0" y="0"/>
-                            <a:ext cx="2240280" cy="2346960"/>
+                            <a:ext cx="2240280" cy="2613660"/>
                           </a:xfrm>
                           <a:prstGeom prst="rect"/>
                         </pic:spPr>
@@ -3799,6 +3779,27 @@
                 <w:color w:val="1F4D78"/>
                 <w:sz w:val="19"/>
               </w:rPr>
+              <w:t xml:space="preserve">取込履歴: </w:t>
+            </w:r>
+            <w:r>
+              <w:rPr>
+                <w:rFonts w:ascii="Calibri" w:hAnsi="Calibri" w:eastAsia="Yu Gothic"/>
+                <w:sz w:val="19"/>
+              </w:rPr>
+              <w:t>取込件数・エラー・完了状態の確認</w:t>
+            </w:r>
+          </w:p>
+          <w:p>
+            <w:pPr>
+              <w:spacing w:after="60"/>
+            </w:pPr>
+            <w:r>
+              <w:rPr>
+                <w:rFonts w:ascii="Calibri" w:hAnsi="Calibri" w:eastAsia="Yu Gothic"/>
+                <w:b/>
+                <w:color w:val="1F4D78"/>
+                <w:sz w:val="19"/>
+              </w:rPr>
               <w:t xml:space="preserve">工種コードマスタ: </w:t>
             </w:r>
             <w:r>
@@ -3848,7 +3849,7 @@
                 <w:rFonts w:ascii="Calibri" w:hAnsi="Calibri" w:eastAsia="Yu Gothic"/>
                 <w:sz w:val="19"/>
               </w:rPr>
-              <w:t>完了工事の非表示と再表示</w:t>
+              <w:t>完了工事のアーカイブと再表示</w:t>
             </w:r>
           </w:p>
           <w:p>
@@ -3901,7 +3902,7 @@
         <w:pStyle w:val="Heading2"/>
       </w:pPr>
       <w:r>
-        <w:t>工事表示設定</w:t>
+        <w:t>取込履歴と工事表示設定</w:t>
       </w:r>
     </w:p>
     <w:p>
@@ -3909,7 +3910,7 @@
         <w:rPr>
           <w:rFonts w:ascii="Calibri" w:hAnsi="Calibri" w:eastAsia="Yu Gothic"/>
         </w:rPr>
-        <w:t>更新が終了した工事のチェックを外すと、請求やPDFを削除せず請求一覧から非表示にできます。再びチェックすると表示へ戻ります。非表示工事へ新しい請求を取り込むと、その工事は自動で表示へ戻ります。</w:t>
+        <w:t>［取込履歴］では、開始・完了日時、ファイル名、登録・PDF・エラー件数、状態を確認できます。［工事表示設定］では、工事コードまたは工事名で検索し、請求件数と最終請求日を確認できます。更新が終了した工事は、データを削除せずアーカイブできます。アーカイブ中は取込と変更処理の対象外です。</w:t>
       </w:r>
     </w:p>
     <w:p>
@@ -3921,63 +3922,11 @@
       </w:r>
     </w:p>
     <w:p>
-      <w:pPr>
-        <w:spacing w:after="80" w:line="300" w:lineRule="auto"/>
-        <w:ind w:left="504" w:hanging="317"/>
-      </w:pPr>
-      <w:r>
-        <w:rPr>
-          <w:rFonts w:ascii="Calibri" w:hAnsi="Calibri" w:eastAsia="Yu Gothic"/>
-          <w:b/>
-          <w:color w:val="0B2545"/>
-        </w:rPr>
-        <w:t xml:space="preserve">1. </w:t>
-      </w:r>
       <w:r>
         <w:rPr>
           <w:rFonts w:ascii="Calibri" w:hAnsi="Calibri" w:eastAsia="Yu Gothic"/>
         </w:rPr>
-        <w:t>請求一覧の［管理メニュー］を押し、［Excel出力］を選びます。</w:t>
-      </w:r>
-    </w:p>
-    <w:p>
-      <w:pPr>
-        <w:spacing w:after="80" w:line="300" w:lineRule="auto"/>
-        <w:ind w:left="504" w:hanging="317"/>
-      </w:pPr>
-      <w:r>
-        <w:rPr>
-          <w:rFonts w:ascii="Calibri" w:hAnsi="Calibri" w:eastAsia="Yu Gothic"/>
-          <w:b/>
-          <w:color w:val="0B2545"/>
-        </w:rPr>
-        <w:t xml:space="preserve">2. </w:t>
-      </w:r>
-      <w:r>
-        <w:rPr>
-          <w:rFonts w:ascii="Calibri" w:hAnsi="Calibri" w:eastAsia="Yu Gothic"/>
-        </w:rPr>
-        <w:t>出力する請求月を選び、［出力］を押します。</w:t>
-      </w:r>
-    </w:p>
-    <w:p>
-      <w:pPr>
-        <w:spacing w:after="80" w:line="300" w:lineRule="auto"/>
-        <w:ind w:left="504" w:hanging="317"/>
-      </w:pPr>
-      <w:r>
-        <w:rPr>
-          <w:rFonts w:ascii="Calibri" w:hAnsi="Calibri" w:eastAsia="Yu Gothic"/>
-          <w:b/>
-          <w:color w:val="0B2545"/>
-        </w:rPr>
-        <w:t xml:space="preserve">3. </w:t>
-      </w:r>
-      <w:r>
-        <w:rPr>
-          <w:rFonts w:ascii="Calibri" w:hAnsi="Calibri" w:eastAsia="Yu Gothic"/>
-        </w:rPr>
-        <w:t>保存完了メッセージに表示されたファイルを確認します。</w:t>
+        <w:t>［Excel出力］で請求月を選んで出力し、完了メッセージに表示されたファイルを確認します。</w:t>
       </w:r>
     </w:p>
     <w:tbl>
@@ -4294,7 +4243,7 @@
                 <w:rFonts w:ascii="Calibri" w:hAnsi="Calibri" w:eastAsia="Yu Gothic"/>
                 <w:sz w:val="19"/>
               </w:rPr>
-              <w:t>新規工事が選択肢にない</w:t>
+              <w:t>新規・アーカイブ工事が選択肢にない</w:t>
             </w:r>
           </w:p>
         </w:tc>
@@ -4317,7 +4266,7 @@
                 <w:rFonts w:ascii="Calibri" w:hAnsi="Calibri" w:eastAsia="Yu Gothic"/>
                 <w:sz w:val="19"/>
               </w:rPr>
-              <w:t>取込画面と管理メニューを閉じて請求一覧へ戻ります</w:t>
+              <w:t>取込画面と管理メニューを閉じます。アーカイブ工事は表示へ戻してから再取込します</w:t>
             </w:r>
           </w:p>
         </w:tc>
@@ -4645,61 +4594,7 @@
                 <w:rFonts w:ascii="Calibri" w:hAnsi="Calibri" w:eastAsia="Yu Gothic"/>
                 <w:sz w:val="20"/>
               </w:rPr>
-              <w:t>削除操作の前に、対象の請求と添付PDFを必ず確認します。</w:t>
-            </w:r>
-          </w:p>
-        </w:tc>
-      </w:tr>
-      <w:tr>
-        <w:tc>
-          <w:tcPr>
-            <w:tcW w:type="dxa" w:w="540"/>
-            <w:vAlign w:val="center"/>
-            <w:shd w:fill="F4F6F9"/>
-            <w:tcMar>
-              <w:top w:w="80" w:type="dxa"/>
-              <w:bottom w:w="80" w:type="dxa"/>
-              <w:start w:w="120" w:type="dxa"/>
-              <w:end w:w="120" w:type="dxa"/>
-            </w:tcMar>
-          </w:tcPr>
-          <w:p>
-            <w:pPr>
-              <w:spacing w:after="0"/>
-              <w:jc w:val="center"/>
-            </w:pPr>
-            <w:r>
-              <w:rPr>
-                <w:rFonts w:ascii="Calibri" w:hAnsi="Calibri" w:eastAsia="Yu Gothic"/>
-                <w:b/>
-                <w:color w:val="009C9A"/>
-                <w:sz w:val="22"/>
-              </w:rPr>
-              <w:t>✓</w:t>
-            </w:r>
-          </w:p>
-        </w:tc>
-        <w:tc>
-          <w:tcPr>
-            <w:tcW w:type="dxa" w:w="8820"/>
-            <w:vAlign w:val="center"/>
-            <w:tcMar>
-              <w:top w:w="80" w:type="dxa"/>
-              <w:bottom w:w="80" w:type="dxa"/>
-              <w:start w:w="120" w:type="dxa"/>
-              <w:end w:w="120" w:type="dxa"/>
-            </w:tcMar>
-          </w:tcPr>
-          <w:p>
-            <w:pPr>
-              <w:spacing w:after="0"/>
-            </w:pPr>
-            <w:r>
-              <w:rPr>
-                <w:rFonts w:ascii="Calibri" w:hAnsi="Calibri" w:eastAsia="Yu Gothic"/>
-                <w:sz w:val="20"/>
-              </w:rPr>
-              <w:t>運用データは社内ルールに従って定期的にバックアップします。</w:t>
+              <w:t>取込、請求月変更・再計算、請求削除の直前にDBが自動バックアップされます。削除対象も必ず確認します。</w:t>
             </w:r>
           </w:p>
         </w:tc>

</xml_diff>